<commit_message>
Update final assignment report
</commit_message>
<xml_diff>
--- a/docs/Chinmay_MERN_Terraform_Ansible_Assignment_Report_FINAL.docx
+++ b/docs/Chinmay_MERN_Terraform_Ansible_Assignment_Report_FINAL.docx
@@ -1,6 +1,6 @@
 
 <file path=word/document.xml><?xml version="1.0" encoding="utf-8"?>
-<w:document xmlns:wpc="http://schemas.microsoft.com/office/word/2010/wordprocessingCanvas" xmlns:cx="http://schemas.microsoft.com/office/drawing/2014/chartex" xmlns:cx1="http://schemas.microsoft.com/office/drawing/2015/9/8/chartex" xmlns:cx2="http://schemas.microsoft.com/office/drawing/2015/10/21/chartex" xmlns:cx3="http://schemas.microsoft.com/office/drawing/2016/5/9/chartex" xmlns:cx4="http://schemas.microsoft.com/office/drawing/2016/5/10/chartex" xmlns:cx5="http://schemas.microsoft.com/office/drawing/2016/5/11/chartex" xmlns:cx6="http://schemas.microsoft.com/office/drawing/2016/5/12/chartex" xmlns:cx7="http://schemas.microsoft.com/office/drawing/2016/5/13/chartex" xmlns:cx8="http://schemas.microsoft.com/office/drawing/2016/5/14/chartex" xmlns:mc="http://schemas.openxmlformats.org/markup-compatibility/2006" xmlns:aink="http://schemas.microsoft.com/office/drawing/2016/ink" xmlns:am3d="http://schemas.microsoft.com/office/drawing/2017/model3d" xmlns:o="urn:schemas-microsoft-com:office:office" xmlns:oel="http://schemas.microsoft.com/office/2019/extlst" xmlns:r="http://schemas.openxmlformats.org/officeDocument/2006/relationships" xmlns:m="http://schemas.openxmlformats.org/officeDocument/2006/math" xmlns:v="urn:schemas-microsoft-com:vml" xmlns:wp14="http://schemas.microsoft.com/office/word/2010/wordprocessingDrawing" xmlns:wp="http://schemas.openxmlformats.org/drawingml/2006/wordprocessingDrawing" xmlns:w10="urn:schemas-microsoft-com:office:word" xmlns:w="http://schemas.openxmlformats.org/wordprocessingml/2006/main" xmlns:w14="http://schemas.microsoft.com/office/word/2010/wordml" xmlns:w15="http://schemas.microsoft.com/office/word/2012/wordml" xmlns:w16cex="http://schemas.microsoft.com/office/word/2018/wordml/cex" xmlns:w16cid="http://schemas.microsoft.com/office/word/2016/wordml/cid" xmlns:w16="http://schemas.microsoft.com/office/word/2018/wordml" xmlns:w16sdtdh="http://schemas.microsoft.com/office/word/2020/wordml/sdtdatahash" xmlns:w16se="http://schemas.microsoft.com/office/word/2015/wordml/symex" xmlns:wpg="http://schemas.microsoft.com/office/word/2010/wordprocessingGroup" xmlns:wpi="http://schemas.microsoft.com/office/word/2010/wordprocessingInk" xmlns:wne="http://schemas.microsoft.com/office/word/2006/wordml" xmlns:wps="http://schemas.microsoft.com/office/word/2010/wordprocessingShape" mc:Ignorable="w14 w15 w16se w16cid w16 w16cex w16sdtdh wp14">
+<w:document xmlns:wpc="http://schemas.microsoft.com/office/word/2010/wordprocessingCanvas" xmlns:cx="http://schemas.microsoft.com/office/drawing/2014/chartex" xmlns:cx1="http://schemas.microsoft.com/office/drawing/2015/9/8/chartex" xmlns:cx2="http://schemas.microsoft.com/office/drawing/2015/10/21/chartex" xmlns:cx3="http://schemas.microsoft.com/office/drawing/2016/5/9/chartex" xmlns:cx4="http://schemas.microsoft.com/office/drawing/2016/5/10/chartex" xmlns:cx5="http://schemas.microsoft.com/office/drawing/2016/5/11/chartex" xmlns:cx6="http://schemas.microsoft.com/office/drawing/2016/5/12/chartex" xmlns:cx7="http://schemas.microsoft.com/office/drawing/2016/5/13/chartex" xmlns:cx8="http://schemas.microsoft.com/office/drawing/2016/5/14/chartex" xmlns:mc="http://schemas.openxmlformats.org/markup-compatibility/2006" xmlns:aink="http://schemas.microsoft.com/office/drawing/2016/ink" xmlns:am3d="http://schemas.microsoft.com/office/drawing/2017/model3d" xmlns:o="urn:schemas-microsoft-com:office:office" xmlns:oel="http://schemas.microsoft.com/office/2019/extlst" xmlns:r="http://schemas.openxmlformats.org/officeDocument/2006/relationships" xmlns:m="http://schemas.openxmlformats.org/officeDocument/2006/math" xmlns:v="urn:schemas-microsoft-com:vml" xmlns:wp14="http://schemas.microsoft.com/office/word/2010/wordprocessingDrawing" xmlns:wp="http://schemas.openxmlformats.org/drawingml/2006/wordprocessingDrawing" xmlns:w10="urn:schemas-microsoft-com:office:word" xmlns:w="http://schemas.openxmlformats.org/wordprocessingml/2006/main" xmlns:w14="http://schemas.microsoft.com/office/word/2010/wordml" xmlns:w15="http://schemas.microsoft.com/office/word/2012/wordml" xmlns:w16cex="http://schemas.microsoft.com/office/word/2018/wordml/cex" xmlns:w16cid="http://schemas.microsoft.com/office/word/2016/wordml/cid" xmlns:w16="http://schemas.microsoft.com/office/word/2018/wordml" xmlns:w16du="http://schemas.microsoft.com/office/word/2023/wordml/word16du" xmlns:w16sdtdh="http://schemas.microsoft.com/office/word/2020/wordml/sdtdatahash" xmlns:w16se="http://schemas.microsoft.com/office/word/2015/wordml/symex" xmlns:wpg="http://schemas.microsoft.com/office/word/2010/wordprocessingGroup" xmlns:wpi="http://schemas.microsoft.com/office/word/2010/wordprocessingInk" xmlns:wne="http://schemas.microsoft.com/office/word/2006/wordml" xmlns:wps="http://schemas.microsoft.com/office/word/2010/wordprocessingShape" mc:Ignorable="w14 w15 w16se w16cid w16 w16cex w16sdtdh w16du wp14">
   <w:body>
     <w:p>
       <w:pPr>
@@ -61,21 +61,7 @@
             <w:color w:val="0563C1"/>
             <w:u w:val="single"/>
           </w:rPr>
-          <w:t>https://github.com/chinmayvyas7/mern-terraform-ansible-d</w:t>
-        </w:r>
-        <w:r>
-          <w:rPr>
-            <w:color w:val="0563C1"/>
-            <w:u w:val="single"/>
-          </w:rPr>
-          <w:t>e</w:t>
-        </w:r>
-        <w:r>
-          <w:rPr>
-            <w:color w:val="0563C1"/>
-            <w:u w:val="single"/>
-          </w:rPr>
-          <w:t>ployment.git</w:t>
+          <w:t>https://github.com/chinmayvyas7/mern-terraform-ansible-deployment.git</w:t>
         </w:r>
       </w:hyperlink>
     </w:p>
@@ -11418,24 +11404,6 @@
         <w:spacing w:after="20" w:line="240" w:lineRule="auto"/>
       </w:pPr>
     </w:p>
-    <w:p>
-      <w:pPr>
-        <w:pStyle w:val="Heading2"/>
-      </w:pPr>
-      <w:r>
-        <w:t>Redaction and review boundary</w:t>
-      </w:r>
-    </w:p>
-    <w:p>
-      <w:r>
-        <w:t>Opaque masks cover unnecessary identity, resource, database-user and administrator-address values in the reproduced images. The public application address is retained because it connects the AWS host to the browser and health tests. No password, private key or unmasked secret value is reproduced in the report.</w:t>
-      </w:r>
-    </w:p>
-    <w:p>
-      <w:r>
-        <w:t>The original source images remain the evidence record. This document uses cropped or redacted copies only; it does not replace the originals or imply that their sensitive contents have been removed. A full source-code archive and an existing Word report were not part of the supplied batch, so repository contents and Git history were not independently audited.</w:t>
-      </w:r>
-    </w:p>
     <w:p/>
     <w:sectPr>
       <w:headerReference w:type="default" r:id="rId34"/>
@@ -11451,7 +11419,7 @@
 </file>
 
 <file path=word/endnotes.xml><?xml version="1.0" encoding="utf-8"?>
-<w:endnotes xmlns:wpc="http://schemas.microsoft.com/office/word/2010/wordprocessingCanvas" xmlns:cx="http://schemas.microsoft.com/office/drawing/2014/chartex" xmlns:cx1="http://schemas.microsoft.com/office/drawing/2015/9/8/chartex" xmlns:cx2="http://schemas.microsoft.com/office/drawing/2015/10/21/chartex" xmlns:cx3="http://schemas.microsoft.com/office/drawing/2016/5/9/chartex" xmlns:cx4="http://schemas.microsoft.com/office/drawing/2016/5/10/chartex" xmlns:cx5="http://schemas.microsoft.com/office/drawing/2016/5/11/chartex" xmlns:cx6="http://schemas.microsoft.com/office/drawing/2016/5/12/chartex" xmlns:cx7="http://schemas.microsoft.com/office/drawing/2016/5/13/chartex" xmlns:cx8="http://schemas.microsoft.com/office/drawing/2016/5/14/chartex" xmlns:mc="http://schemas.openxmlformats.org/markup-compatibility/2006" xmlns:aink="http://schemas.microsoft.com/office/drawing/2016/ink" xmlns:am3d="http://schemas.microsoft.com/office/drawing/2017/model3d" xmlns:o="urn:schemas-microsoft-com:office:office" xmlns:oel="http://schemas.microsoft.com/office/2019/extlst" xmlns:r="http://schemas.openxmlformats.org/officeDocument/2006/relationships" xmlns:m="http://schemas.openxmlformats.org/officeDocument/2006/math" xmlns:v="urn:schemas-microsoft-com:vml" xmlns:wp14="http://schemas.microsoft.com/office/word/2010/wordprocessingDrawing" xmlns:wp="http://schemas.openxmlformats.org/drawingml/2006/wordprocessingDrawing" xmlns:w10="urn:schemas-microsoft-com:office:word" xmlns:w="http://schemas.openxmlformats.org/wordprocessingml/2006/main" xmlns:w14="http://schemas.microsoft.com/office/word/2010/wordml" xmlns:w15="http://schemas.microsoft.com/office/word/2012/wordml" xmlns:w16cex="http://schemas.microsoft.com/office/word/2018/wordml/cex" xmlns:w16cid="http://schemas.microsoft.com/office/word/2016/wordml/cid" xmlns:w16="http://schemas.microsoft.com/office/word/2018/wordml" xmlns:w16sdtdh="http://schemas.microsoft.com/office/word/2020/wordml/sdtdatahash" xmlns:w16se="http://schemas.microsoft.com/office/word/2015/wordml/symex" xmlns:wpg="http://schemas.microsoft.com/office/word/2010/wordprocessingGroup" xmlns:wpi="http://schemas.microsoft.com/office/word/2010/wordprocessingInk" xmlns:wne="http://schemas.microsoft.com/office/word/2006/wordml" xmlns:wps="http://schemas.microsoft.com/office/word/2010/wordprocessingShape" mc:Ignorable="w14 w15 w16se w16cid w16 w16cex w16sdtdh wp14">
+<w:endnotes xmlns:wpc="http://schemas.microsoft.com/office/word/2010/wordprocessingCanvas" xmlns:cx="http://schemas.microsoft.com/office/drawing/2014/chartex" xmlns:cx1="http://schemas.microsoft.com/office/drawing/2015/9/8/chartex" xmlns:cx2="http://schemas.microsoft.com/office/drawing/2015/10/21/chartex" xmlns:cx3="http://schemas.microsoft.com/office/drawing/2016/5/9/chartex" xmlns:cx4="http://schemas.microsoft.com/office/drawing/2016/5/10/chartex" xmlns:cx5="http://schemas.microsoft.com/office/drawing/2016/5/11/chartex" xmlns:cx6="http://schemas.microsoft.com/office/drawing/2016/5/12/chartex" xmlns:cx7="http://schemas.microsoft.com/office/drawing/2016/5/13/chartex" xmlns:cx8="http://schemas.microsoft.com/office/drawing/2016/5/14/chartex" xmlns:mc="http://schemas.openxmlformats.org/markup-compatibility/2006" xmlns:aink="http://schemas.microsoft.com/office/drawing/2016/ink" xmlns:am3d="http://schemas.microsoft.com/office/drawing/2017/model3d" xmlns:o="urn:schemas-microsoft-com:office:office" xmlns:oel="http://schemas.microsoft.com/office/2019/extlst" xmlns:r="http://schemas.openxmlformats.org/officeDocument/2006/relationships" xmlns:m="http://schemas.openxmlformats.org/officeDocument/2006/math" xmlns:v="urn:schemas-microsoft-com:vml" xmlns:wp14="http://schemas.microsoft.com/office/word/2010/wordprocessingDrawing" xmlns:wp="http://schemas.openxmlformats.org/drawingml/2006/wordprocessingDrawing" xmlns:w10="urn:schemas-microsoft-com:office:word" xmlns:w="http://schemas.openxmlformats.org/wordprocessingml/2006/main" xmlns:w14="http://schemas.microsoft.com/office/word/2010/wordml" xmlns:w15="http://schemas.microsoft.com/office/word/2012/wordml" xmlns:w16cex="http://schemas.microsoft.com/office/word/2018/wordml/cex" xmlns:w16cid="http://schemas.microsoft.com/office/word/2016/wordml/cid" xmlns:w16="http://schemas.microsoft.com/office/word/2018/wordml" xmlns:w16du="http://schemas.microsoft.com/office/word/2023/wordml/word16du" xmlns:w16sdtdh="http://schemas.microsoft.com/office/word/2020/wordml/sdtdatahash" xmlns:w16se="http://schemas.microsoft.com/office/word/2015/wordml/symex" xmlns:wpg="http://schemas.microsoft.com/office/word/2010/wordprocessingGroup" xmlns:wpi="http://schemas.microsoft.com/office/word/2010/wordprocessingInk" xmlns:wne="http://schemas.microsoft.com/office/word/2006/wordml" xmlns:wps="http://schemas.microsoft.com/office/word/2010/wordprocessingShape" mc:Ignorable="w14 w15 w16se w16cid w16 w16cex w16sdtdh w16du wp14">
   <w:endnote w:type="separator" w:id="-1">
     <w:p>
       <w:pPr>
@@ -11476,7 +11444,7 @@
 </file>
 
 <file path=word/footer1.xml><?xml version="1.0" encoding="utf-8"?>
-<w:ftr xmlns:wpc="http://schemas.microsoft.com/office/word/2010/wordprocessingCanvas" xmlns:cx="http://schemas.microsoft.com/office/drawing/2014/chartex" xmlns:cx1="http://schemas.microsoft.com/office/drawing/2015/9/8/chartex" xmlns:cx2="http://schemas.microsoft.com/office/drawing/2015/10/21/chartex" xmlns:cx3="http://schemas.microsoft.com/office/drawing/2016/5/9/chartex" xmlns:cx4="http://schemas.microsoft.com/office/drawing/2016/5/10/chartex" xmlns:cx5="http://schemas.microsoft.com/office/drawing/2016/5/11/chartex" xmlns:cx6="http://schemas.microsoft.com/office/drawing/2016/5/12/chartex" xmlns:cx7="http://schemas.microsoft.com/office/drawing/2016/5/13/chartex" xmlns:cx8="http://schemas.microsoft.com/office/drawing/2016/5/14/chartex" xmlns:mc="http://schemas.openxmlformats.org/markup-compatibility/2006" xmlns:aink="http://schemas.microsoft.com/office/drawing/2016/ink" xmlns:am3d="http://schemas.microsoft.com/office/drawing/2017/model3d" xmlns:o="urn:schemas-microsoft-com:office:office" xmlns:oel="http://schemas.microsoft.com/office/2019/extlst" xmlns:r="http://schemas.openxmlformats.org/officeDocument/2006/relationships" xmlns:m="http://schemas.openxmlformats.org/officeDocument/2006/math" xmlns:v="urn:schemas-microsoft-com:vml" xmlns:wp14="http://schemas.microsoft.com/office/word/2010/wordprocessingDrawing" xmlns:wp="http://schemas.openxmlformats.org/drawingml/2006/wordprocessingDrawing" xmlns:w10="urn:schemas-microsoft-com:office:word" xmlns:w="http://schemas.openxmlformats.org/wordprocessingml/2006/main" xmlns:w14="http://schemas.microsoft.com/office/word/2010/wordml" xmlns:w15="http://schemas.microsoft.com/office/word/2012/wordml" xmlns:w16cex="http://schemas.microsoft.com/office/word/2018/wordml/cex" xmlns:w16cid="http://schemas.microsoft.com/office/word/2016/wordml/cid" xmlns:w16="http://schemas.microsoft.com/office/word/2018/wordml" xmlns:w16sdtdh="http://schemas.microsoft.com/office/word/2020/wordml/sdtdatahash" xmlns:w16se="http://schemas.microsoft.com/office/word/2015/wordml/symex" xmlns:wpg="http://schemas.microsoft.com/office/word/2010/wordprocessingGroup" xmlns:wpi="http://schemas.microsoft.com/office/word/2010/wordprocessingInk" xmlns:wne="http://schemas.microsoft.com/office/word/2006/wordml" xmlns:wps="http://schemas.microsoft.com/office/word/2010/wordprocessingShape" mc:Ignorable="w14 w15 w16se w16cid w16 w16cex w16sdtdh wp14">
+<w:ftr xmlns:wpc="http://schemas.microsoft.com/office/word/2010/wordprocessingCanvas" xmlns:cx="http://schemas.microsoft.com/office/drawing/2014/chartex" xmlns:cx1="http://schemas.microsoft.com/office/drawing/2015/9/8/chartex" xmlns:cx2="http://schemas.microsoft.com/office/drawing/2015/10/21/chartex" xmlns:cx3="http://schemas.microsoft.com/office/drawing/2016/5/9/chartex" xmlns:cx4="http://schemas.microsoft.com/office/drawing/2016/5/10/chartex" xmlns:cx5="http://schemas.microsoft.com/office/drawing/2016/5/11/chartex" xmlns:cx6="http://schemas.microsoft.com/office/drawing/2016/5/12/chartex" xmlns:cx7="http://schemas.microsoft.com/office/drawing/2016/5/13/chartex" xmlns:cx8="http://schemas.microsoft.com/office/drawing/2016/5/14/chartex" xmlns:mc="http://schemas.openxmlformats.org/markup-compatibility/2006" xmlns:aink="http://schemas.microsoft.com/office/drawing/2016/ink" xmlns:am3d="http://schemas.microsoft.com/office/drawing/2017/model3d" xmlns:o="urn:schemas-microsoft-com:office:office" xmlns:oel="http://schemas.microsoft.com/office/2019/extlst" xmlns:r="http://schemas.openxmlformats.org/officeDocument/2006/relationships" xmlns:m="http://schemas.openxmlformats.org/officeDocument/2006/math" xmlns:v="urn:schemas-microsoft-com:vml" xmlns:wp14="http://schemas.microsoft.com/office/word/2010/wordprocessingDrawing" xmlns:wp="http://schemas.openxmlformats.org/drawingml/2006/wordprocessingDrawing" xmlns:w10="urn:schemas-microsoft-com:office:word" xmlns:w="http://schemas.openxmlformats.org/wordprocessingml/2006/main" xmlns:w14="http://schemas.microsoft.com/office/word/2010/wordml" xmlns:w15="http://schemas.microsoft.com/office/word/2012/wordml" xmlns:w16cex="http://schemas.microsoft.com/office/word/2018/wordml/cex" xmlns:w16cid="http://schemas.microsoft.com/office/word/2016/wordml/cid" xmlns:w16="http://schemas.microsoft.com/office/word/2018/wordml" xmlns:w16du="http://schemas.microsoft.com/office/word/2023/wordml/word16du" xmlns:w16sdtdh="http://schemas.microsoft.com/office/word/2020/wordml/sdtdatahash" xmlns:w16se="http://schemas.microsoft.com/office/word/2015/wordml/symex" xmlns:wpg="http://schemas.microsoft.com/office/word/2010/wordprocessingGroup" xmlns:wpi="http://schemas.microsoft.com/office/word/2010/wordprocessingInk" xmlns:wne="http://schemas.microsoft.com/office/word/2006/wordml" xmlns:wps="http://schemas.microsoft.com/office/word/2010/wordprocessingShape" mc:Ignorable="w14 w15 w16se w16cid w16 w16cex w16sdtdh w16du wp14">
   <w:p>
     <w:pPr>
       <w:pStyle w:val="Footer"/>
@@ -11524,7 +11492,7 @@
 </file>
 
 <file path=word/footnotes.xml><?xml version="1.0" encoding="utf-8"?>
-<w:footnotes xmlns:wpc="http://schemas.microsoft.com/office/word/2010/wordprocessingCanvas" xmlns:cx="http://schemas.microsoft.com/office/drawing/2014/chartex" xmlns:cx1="http://schemas.microsoft.com/office/drawing/2015/9/8/chartex" xmlns:cx2="http://schemas.microsoft.com/office/drawing/2015/10/21/chartex" xmlns:cx3="http://schemas.microsoft.com/office/drawing/2016/5/9/chartex" xmlns:cx4="http://schemas.microsoft.com/office/drawing/2016/5/10/chartex" xmlns:cx5="http://schemas.microsoft.com/office/drawing/2016/5/11/chartex" xmlns:cx6="http://schemas.microsoft.com/office/drawing/2016/5/12/chartex" xmlns:cx7="http://schemas.microsoft.com/office/drawing/2016/5/13/chartex" xmlns:cx8="http://schemas.microsoft.com/office/drawing/2016/5/14/chartex" xmlns:mc="http://schemas.openxmlformats.org/markup-compatibility/2006" xmlns:aink="http://schemas.microsoft.com/office/drawing/2016/ink" xmlns:am3d="http://schemas.microsoft.com/office/drawing/2017/model3d" xmlns:o="urn:schemas-microsoft-com:office:office" xmlns:oel="http://schemas.microsoft.com/office/2019/extlst" xmlns:r="http://schemas.openxmlformats.org/officeDocument/2006/relationships" xmlns:m="http://schemas.openxmlformats.org/officeDocument/2006/math" xmlns:v="urn:schemas-microsoft-com:vml" xmlns:wp14="http://schemas.microsoft.com/office/word/2010/wordprocessingDrawing" xmlns:wp="http://schemas.openxmlformats.org/drawingml/2006/wordprocessingDrawing" xmlns:w10="urn:schemas-microsoft-com:office:word" xmlns:w="http://schemas.openxmlformats.org/wordprocessingml/2006/main" xmlns:w14="http://schemas.microsoft.com/office/word/2010/wordml" xmlns:w15="http://schemas.microsoft.com/office/word/2012/wordml" xmlns:w16cex="http://schemas.microsoft.com/office/word/2018/wordml/cex" xmlns:w16cid="http://schemas.microsoft.com/office/word/2016/wordml/cid" xmlns:w16="http://schemas.microsoft.com/office/word/2018/wordml" xmlns:w16sdtdh="http://schemas.microsoft.com/office/word/2020/wordml/sdtdatahash" xmlns:w16se="http://schemas.microsoft.com/office/word/2015/wordml/symex" xmlns:wpg="http://schemas.microsoft.com/office/word/2010/wordprocessingGroup" xmlns:wpi="http://schemas.microsoft.com/office/word/2010/wordprocessingInk" xmlns:wne="http://schemas.microsoft.com/office/word/2006/wordml" xmlns:wps="http://schemas.microsoft.com/office/word/2010/wordprocessingShape" mc:Ignorable="w14 w15 w16se w16cid w16 w16cex w16sdtdh wp14">
+<w:footnotes xmlns:wpc="http://schemas.microsoft.com/office/word/2010/wordprocessingCanvas" xmlns:cx="http://schemas.microsoft.com/office/drawing/2014/chartex" xmlns:cx1="http://schemas.microsoft.com/office/drawing/2015/9/8/chartex" xmlns:cx2="http://schemas.microsoft.com/office/drawing/2015/10/21/chartex" xmlns:cx3="http://schemas.microsoft.com/office/drawing/2016/5/9/chartex" xmlns:cx4="http://schemas.microsoft.com/office/drawing/2016/5/10/chartex" xmlns:cx5="http://schemas.microsoft.com/office/drawing/2016/5/11/chartex" xmlns:cx6="http://schemas.microsoft.com/office/drawing/2016/5/12/chartex" xmlns:cx7="http://schemas.microsoft.com/office/drawing/2016/5/13/chartex" xmlns:cx8="http://schemas.microsoft.com/office/drawing/2016/5/14/chartex" xmlns:mc="http://schemas.openxmlformats.org/markup-compatibility/2006" xmlns:aink="http://schemas.microsoft.com/office/drawing/2016/ink" xmlns:am3d="http://schemas.microsoft.com/office/drawing/2017/model3d" xmlns:o="urn:schemas-microsoft-com:office:office" xmlns:oel="http://schemas.microsoft.com/office/2019/extlst" xmlns:r="http://schemas.openxmlformats.org/officeDocument/2006/relationships" xmlns:m="http://schemas.openxmlformats.org/officeDocument/2006/math" xmlns:v="urn:schemas-microsoft-com:vml" xmlns:wp14="http://schemas.microsoft.com/office/word/2010/wordprocessingDrawing" xmlns:wp="http://schemas.openxmlformats.org/drawingml/2006/wordprocessingDrawing" xmlns:w10="urn:schemas-microsoft-com:office:word" xmlns:w="http://schemas.openxmlformats.org/wordprocessingml/2006/main" xmlns:w14="http://schemas.microsoft.com/office/word/2010/wordml" xmlns:w15="http://schemas.microsoft.com/office/word/2012/wordml" xmlns:w16cex="http://schemas.microsoft.com/office/word/2018/wordml/cex" xmlns:w16cid="http://schemas.microsoft.com/office/word/2016/wordml/cid" xmlns:w16="http://schemas.microsoft.com/office/word/2018/wordml" xmlns:w16du="http://schemas.microsoft.com/office/word/2023/wordml/word16du" xmlns:w16sdtdh="http://schemas.microsoft.com/office/word/2020/wordml/sdtdatahash" xmlns:w16se="http://schemas.microsoft.com/office/word/2015/wordml/symex" xmlns:wpg="http://schemas.microsoft.com/office/word/2010/wordprocessingGroup" xmlns:wpi="http://schemas.microsoft.com/office/word/2010/wordprocessingInk" xmlns:wne="http://schemas.microsoft.com/office/word/2006/wordml" xmlns:wps="http://schemas.microsoft.com/office/word/2010/wordprocessingShape" mc:Ignorable="w14 w15 w16se w16cid w16 w16cex w16sdtdh w16du wp14">
   <w:footnote w:type="separator" w:id="-1">
     <w:p>
       <w:pPr>
@@ -11549,7 +11517,7 @@
 </file>
 
 <file path=word/header1.xml><?xml version="1.0" encoding="utf-8"?>
-<w:hdr xmlns:wpc="http://schemas.microsoft.com/office/word/2010/wordprocessingCanvas" xmlns:cx="http://schemas.microsoft.com/office/drawing/2014/chartex" xmlns:cx1="http://schemas.microsoft.com/office/drawing/2015/9/8/chartex" xmlns:cx2="http://schemas.microsoft.com/office/drawing/2015/10/21/chartex" xmlns:cx3="http://schemas.microsoft.com/office/drawing/2016/5/9/chartex" xmlns:cx4="http://schemas.microsoft.com/office/drawing/2016/5/10/chartex" xmlns:cx5="http://schemas.microsoft.com/office/drawing/2016/5/11/chartex" xmlns:cx6="http://schemas.microsoft.com/office/drawing/2016/5/12/chartex" xmlns:cx7="http://schemas.microsoft.com/office/drawing/2016/5/13/chartex" xmlns:cx8="http://schemas.microsoft.com/office/drawing/2016/5/14/chartex" xmlns:mc="http://schemas.openxmlformats.org/markup-compatibility/2006" xmlns:aink="http://schemas.microsoft.com/office/drawing/2016/ink" xmlns:am3d="http://schemas.microsoft.com/office/drawing/2017/model3d" xmlns:o="urn:schemas-microsoft-com:office:office" xmlns:oel="http://schemas.microsoft.com/office/2019/extlst" xmlns:r="http://schemas.openxmlformats.org/officeDocument/2006/relationships" xmlns:m="http://schemas.openxmlformats.org/officeDocument/2006/math" xmlns:v="urn:schemas-microsoft-com:vml" xmlns:wp14="http://schemas.microsoft.com/office/word/2010/wordprocessingDrawing" xmlns:wp="http://schemas.openxmlformats.org/drawingml/2006/wordprocessingDrawing" xmlns:w10="urn:schemas-microsoft-com:office:word" xmlns:w="http://schemas.openxmlformats.org/wordprocessingml/2006/main" xmlns:w14="http://schemas.microsoft.com/office/word/2010/wordml" xmlns:w15="http://schemas.microsoft.com/office/word/2012/wordml" xmlns:w16cex="http://schemas.microsoft.com/office/word/2018/wordml/cex" xmlns:w16cid="http://schemas.microsoft.com/office/word/2016/wordml/cid" xmlns:w16="http://schemas.microsoft.com/office/word/2018/wordml" xmlns:w16sdtdh="http://schemas.microsoft.com/office/word/2020/wordml/sdtdatahash" xmlns:w16se="http://schemas.microsoft.com/office/word/2015/wordml/symex" xmlns:wpg="http://schemas.microsoft.com/office/word/2010/wordprocessingGroup" xmlns:wpi="http://schemas.microsoft.com/office/word/2010/wordprocessingInk" xmlns:wne="http://schemas.microsoft.com/office/word/2006/wordml" xmlns:wps="http://schemas.microsoft.com/office/word/2010/wordprocessingShape" mc:Ignorable="w14 w15 w16se w16cid w16 w16cex w16sdtdh wp14">
+<w:hdr xmlns:wpc="http://schemas.microsoft.com/office/word/2010/wordprocessingCanvas" xmlns:cx="http://schemas.microsoft.com/office/drawing/2014/chartex" xmlns:cx1="http://schemas.microsoft.com/office/drawing/2015/9/8/chartex" xmlns:cx2="http://schemas.microsoft.com/office/drawing/2015/10/21/chartex" xmlns:cx3="http://schemas.microsoft.com/office/drawing/2016/5/9/chartex" xmlns:cx4="http://schemas.microsoft.com/office/drawing/2016/5/10/chartex" xmlns:cx5="http://schemas.microsoft.com/office/drawing/2016/5/11/chartex" xmlns:cx6="http://schemas.microsoft.com/office/drawing/2016/5/12/chartex" xmlns:cx7="http://schemas.microsoft.com/office/drawing/2016/5/13/chartex" xmlns:cx8="http://schemas.microsoft.com/office/drawing/2016/5/14/chartex" xmlns:mc="http://schemas.openxmlformats.org/markup-compatibility/2006" xmlns:aink="http://schemas.microsoft.com/office/drawing/2016/ink" xmlns:am3d="http://schemas.microsoft.com/office/drawing/2017/model3d" xmlns:o="urn:schemas-microsoft-com:office:office" xmlns:oel="http://schemas.microsoft.com/office/2019/extlst" xmlns:r="http://schemas.openxmlformats.org/officeDocument/2006/relationships" xmlns:m="http://schemas.openxmlformats.org/officeDocument/2006/math" xmlns:v="urn:schemas-microsoft-com:vml" xmlns:wp14="http://schemas.microsoft.com/office/word/2010/wordprocessingDrawing" xmlns:wp="http://schemas.openxmlformats.org/drawingml/2006/wordprocessingDrawing" xmlns:w10="urn:schemas-microsoft-com:office:word" xmlns:w="http://schemas.openxmlformats.org/wordprocessingml/2006/main" xmlns:w14="http://schemas.microsoft.com/office/word/2010/wordml" xmlns:w15="http://schemas.microsoft.com/office/word/2012/wordml" xmlns:w16cex="http://schemas.microsoft.com/office/word/2018/wordml/cex" xmlns:w16cid="http://schemas.microsoft.com/office/word/2016/wordml/cid" xmlns:w16="http://schemas.microsoft.com/office/word/2018/wordml" xmlns:w16du="http://schemas.microsoft.com/office/word/2023/wordml/word16du" xmlns:w16sdtdh="http://schemas.microsoft.com/office/word/2020/wordml/sdtdatahash" xmlns:w16se="http://schemas.microsoft.com/office/word/2015/wordml/symex" xmlns:wpg="http://schemas.microsoft.com/office/word/2010/wordprocessingGroup" xmlns:wpi="http://schemas.microsoft.com/office/word/2010/wordprocessingInk" xmlns:wne="http://schemas.microsoft.com/office/word/2006/wordml" xmlns:wps="http://schemas.microsoft.com/office/word/2010/wordprocessingShape" mc:Ignorable="w14 w15 w16se w16cid w16 w16cex w16sdtdh w16du wp14">
   <w:p>
     <w:pPr>
       <w:pStyle w:val="Header"/>
@@ -11565,7 +11533,7 @@
 </file>
 
 <file path=word/numbering.xml><?xml version="1.0" encoding="utf-8"?>
-<w:numbering xmlns:wpc="http://schemas.microsoft.com/office/word/2010/wordprocessingCanvas" xmlns:cx="http://schemas.microsoft.com/office/drawing/2014/chartex" xmlns:cx1="http://schemas.microsoft.com/office/drawing/2015/9/8/chartex" xmlns:cx2="http://schemas.microsoft.com/office/drawing/2015/10/21/chartex" xmlns:cx3="http://schemas.microsoft.com/office/drawing/2016/5/9/chartex" xmlns:cx4="http://schemas.microsoft.com/office/drawing/2016/5/10/chartex" xmlns:cx5="http://schemas.microsoft.com/office/drawing/2016/5/11/chartex" xmlns:cx6="http://schemas.microsoft.com/office/drawing/2016/5/12/chartex" xmlns:cx7="http://schemas.microsoft.com/office/drawing/2016/5/13/chartex" xmlns:cx8="http://schemas.microsoft.com/office/drawing/2016/5/14/chartex" xmlns:mc="http://schemas.openxmlformats.org/markup-compatibility/2006" xmlns:aink="http://schemas.microsoft.com/office/drawing/2016/ink" xmlns:am3d="http://schemas.microsoft.com/office/drawing/2017/model3d" xmlns:o="urn:schemas-microsoft-com:office:office" xmlns:oel="http://schemas.microsoft.com/office/2019/extlst" xmlns:r="http://schemas.openxmlformats.org/officeDocument/2006/relationships" xmlns:m="http://schemas.openxmlformats.org/officeDocument/2006/math" xmlns:v="urn:schemas-microsoft-com:vml" xmlns:wp14="http://schemas.microsoft.com/office/word/2010/wordprocessingDrawing" xmlns:wp="http://schemas.openxmlformats.org/drawingml/2006/wordprocessingDrawing" xmlns:w10="urn:schemas-microsoft-com:office:word" xmlns:w="http://schemas.openxmlformats.org/wordprocessingml/2006/main" xmlns:w14="http://schemas.microsoft.com/office/word/2010/wordml" xmlns:w15="http://schemas.microsoft.com/office/word/2012/wordml" xmlns:w16cex="http://schemas.microsoft.com/office/word/2018/wordml/cex" xmlns:w16cid="http://schemas.microsoft.com/office/word/2016/wordml/cid" xmlns:w16="http://schemas.microsoft.com/office/word/2018/wordml" xmlns:w16sdtdh="http://schemas.microsoft.com/office/word/2020/wordml/sdtdatahash" xmlns:w16se="http://schemas.microsoft.com/office/word/2015/wordml/symex" xmlns:wpg="http://schemas.microsoft.com/office/word/2010/wordprocessingGroup" xmlns:wpi="http://schemas.microsoft.com/office/word/2010/wordprocessingInk" xmlns:wne="http://schemas.microsoft.com/office/word/2006/wordml" xmlns:wps="http://schemas.microsoft.com/office/word/2010/wordprocessingShape" mc:Ignorable="w14 w15 w16se w16cid w16 w16cex w16sdtdh wp14">
+<w:numbering xmlns:wpc="http://schemas.microsoft.com/office/word/2010/wordprocessingCanvas" xmlns:cx="http://schemas.microsoft.com/office/drawing/2014/chartex" xmlns:cx1="http://schemas.microsoft.com/office/drawing/2015/9/8/chartex" xmlns:cx2="http://schemas.microsoft.com/office/drawing/2015/10/21/chartex" xmlns:cx3="http://schemas.microsoft.com/office/drawing/2016/5/9/chartex" xmlns:cx4="http://schemas.microsoft.com/office/drawing/2016/5/10/chartex" xmlns:cx5="http://schemas.microsoft.com/office/drawing/2016/5/11/chartex" xmlns:cx6="http://schemas.microsoft.com/office/drawing/2016/5/12/chartex" xmlns:cx7="http://schemas.microsoft.com/office/drawing/2016/5/13/chartex" xmlns:cx8="http://schemas.microsoft.com/office/drawing/2016/5/14/chartex" xmlns:mc="http://schemas.openxmlformats.org/markup-compatibility/2006" xmlns:aink="http://schemas.microsoft.com/office/drawing/2016/ink" xmlns:am3d="http://schemas.microsoft.com/office/drawing/2017/model3d" xmlns:o="urn:schemas-microsoft-com:office:office" xmlns:oel="http://schemas.microsoft.com/office/2019/extlst" xmlns:r="http://schemas.openxmlformats.org/officeDocument/2006/relationships" xmlns:m="http://schemas.openxmlformats.org/officeDocument/2006/math" xmlns:v="urn:schemas-microsoft-com:vml" xmlns:wp14="http://schemas.microsoft.com/office/word/2010/wordprocessingDrawing" xmlns:wp="http://schemas.openxmlformats.org/drawingml/2006/wordprocessingDrawing" xmlns:w10="urn:schemas-microsoft-com:office:word" xmlns:w="http://schemas.openxmlformats.org/wordprocessingml/2006/main" xmlns:w14="http://schemas.microsoft.com/office/word/2010/wordml" xmlns:w15="http://schemas.microsoft.com/office/word/2012/wordml" xmlns:w16cex="http://schemas.microsoft.com/office/word/2018/wordml/cex" xmlns:w16cid="http://schemas.microsoft.com/office/word/2016/wordml/cid" xmlns:w16="http://schemas.microsoft.com/office/word/2018/wordml" xmlns:w16du="http://schemas.microsoft.com/office/word/2023/wordml/word16du" xmlns:w16sdtdh="http://schemas.microsoft.com/office/word/2020/wordml/sdtdatahash" xmlns:w16se="http://schemas.microsoft.com/office/word/2015/wordml/symex" xmlns:wpg="http://schemas.microsoft.com/office/word/2010/wordprocessingGroup" xmlns:wpi="http://schemas.microsoft.com/office/word/2010/wordprocessingInk" xmlns:wne="http://schemas.microsoft.com/office/word/2006/wordml" xmlns:wps="http://schemas.microsoft.com/office/word/2010/wordprocessingShape" mc:Ignorable="w14 w15 w16se w16cid w16 w16cex w16sdtdh w16du wp14">
   <w:abstractNum w:abstractNumId="0" w15:restartNumberingAfterBreak="0">
     <w:nsid w:val="FFFFFF7C"/>
     <w:multiLevelType w:val="singleLevel"/>
@@ -11768,7 +11736,7 @@
 </file>
 
 <file path=word/styles.xml><?xml version="1.0" encoding="utf-8"?>
-<w:styles xmlns:mc="http://schemas.openxmlformats.org/markup-compatibility/2006" xmlns:r="http://schemas.openxmlformats.org/officeDocument/2006/relationships" xmlns:w="http://schemas.openxmlformats.org/wordprocessingml/2006/main" xmlns:w14="http://schemas.microsoft.com/office/word/2010/wordml" xmlns:w15="http://schemas.microsoft.com/office/word/2012/wordml" xmlns:w16cex="http://schemas.microsoft.com/office/word/2018/wordml/cex" xmlns:w16cid="http://schemas.microsoft.com/office/word/2016/wordml/cid" xmlns:w16="http://schemas.microsoft.com/office/word/2018/wordml" xmlns:w16sdtdh="http://schemas.microsoft.com/office/word/2020/wordml/sdtdatahash" xmlns:w16se="http://schemas.microsoft.com/office/word/2015/wordml/symex" mc:Ignorable="w14 w15 w16se w16cid w16 w16cex w16sdtdh">
+<w:styles xmlns:mc="http://schemas.openxmlformats.org/markup-compatibility/2006" xmlns:r="http://schemas.openxmlformats.org/officeDocument/2006/relationships" xmlns:w="http://schemas.openxmlformats.org/wordprocessingml/2006/main" xmlns:w14="http://schemas.microsoft.com/office/word/2010/wordml" xmlns:w15="http://schemas.microsoft.com/office/word/2012/wordml" xmlns:w16cex="http://schemas.microsoft.com/office/word/2018/wordml/cex" xmlns:w16cid="http://schemas.microsoft.com/office/word/2016/wordml/cid" xmlns:w16="http://schemas.microsoft.com/office/word/2018/wordml" xmlns:w16du="http://schemas.microsoft.com/office/word/2023/wordml/word16du" xmlns:w16sdtdh="http://schemas.microsoft.com/office/word/2020/wordml/sdtdatahash" xmlns:w16se="http://schemas.microsoft.com/office/word/2015/wordml/symex" mc:Ignorable="w14 w15 w16se w16cid w16 w16cex w16sdtdh w16du">
   <w:docDefaults>
     <w:rPrDefault>
       <w:rPr>

</xml_diff>